<commit_message>
feat: add companion personas and validate everyday conversations
</commit_message>
<xml_diff>
--- a/docs/衣衣双助理陪伴与可配置人格Skill年度规划.docx
+++ b/docs/衣衣双助理陪伴与可配置人格Skill年度规划.docx
@@ -31,7 +31,7 @@
         <w:rPr>
           <w:b/>
         </w:rPr>
-        <w:t>衣衣以日常AI陪伴为体验主线。女性用户由男性助理提供细致、稳定、有回应的关怀；男性用户由女性助理提供俏皮可爱、适度性感、带一点暧昧的陪伴。两条路线都需要认真听见用户、照顾实际需求。</w:t>
+        <w:t>衣衣以日常AI陪伴为体验主线。女性用户由男性助理提供细致、稳定、有回应的关怀；男性用户由女性助理提供细腻体贴、温柔可爱、从容有韵味的陪伴。两条路线都需要认真听见用户、照顾实际需求。</w:t>
       </w:r>
     </w:p>
     <w:p>
@@ -441,7 +441,7 @@
         <w:rPr>
           <w:b w:val="0"/>
         </w:rPr>
-        <w:t>本稿为设计规划。现有本地代码已具备男女形象切换与真实阶段反馈；用户性别自动匹配、人格池、长期关怀与配置发布体系均属本次新增需求，不能视为已部署。</w:t>
+        <w:t>本稿为设计规划。本地已接入男女形象、对应人格与日常对话；账号匹配、长期记忆及配置发布尚未实现。最新要求与证据见文末补充。</w:t>
       </w:r>
     </w:p>
     <w:p>
@@ -2105,7 +2105,7 @@
         <w:pStyle w:val="Heading2"/>
       </w:pPr>
       <w:r>
-        <w:t>主要体验 俏皮可爱与一点心动</w:t>
+        <w:t>主要体验 细腻体贴与从容韵味</w:t>
       </w:r>
     </w:p>
     <w:p>
@@ -2121,7 +2121,7 @@
         <w:rPr>
           <w:b w:val="0"/>
         </w:rPr>
-        <w:t>首个人格建议为“俏皮微暧昧型”，默认昵称仍可用“衣衣”。形象保持明确成年感，俏皮来自动作与性格。若现有Q版用于工具状态，可另做成年比例的对话半身形象，分别承担轻量反馈和氛围互动。</w:t>
+        <w:t>首个人格建议为“体贴从容型”，默认昵称仍可用“衣衣”。形象保持明确成年感，俏皮来自动作与性格。若现有Q版用于工具状态，可另做成年比例的对话半身形象，分别承担轻量反馈和氛围互动。</w:t>
       </w:r>
     </w:p>
     <w:p>
@@ -7436,7 +7436,7 @@
           <w:b w:val="0"/>
           <w:sz w:val="17"/>
         </w:rPr>
-        <w:t>persona_id: male_calm_care</w:t>
+        <w:t>persona_id: male_calm_v1</w:t>
       </w:r>
     </w:p>
     <w:p>
@@ -7647,7 +7647,7 @@
         <w:pStyle w:val="Heading2"/>
       </w:pPr>
       <w:r>
-        <w:t>女性助理 俏皮微暧昧型</w:t>
+        <w:t>女性助理 体贴从容型</w:t>
       </w:r>
     </w:p>
     <w:p>
@@ -7675,7 +7675,7 @@
           <w:b w:val="0"/>
           <w:sz w:val="17"/>
         </w:rPr>
-        <w:t>persona_id: female_playful_flirt</w:t>
+        <w:t>persona_id: female_warm_v1</w:t>
       </w:r>
     </w:p>
     <w:p>
@@ -8550,7 +8550,7 @@
         <w:rPr>
           <w:b w:val="0"/>
         </w:rPr>
-        <w:t>先打磨沉稳照顾型男性助理和俏皮微暧昧型女性助理。新增角色需要在称呼、回应节奏、关怀动作与场景例句上形成可辨认差异；不能仅换名字和立绘。治愈作为风格描述，不承诺治疗效果。</w:t>
+        <w:t>先打磨沉稳照顾型男性助理和体贴从容型女性助理。新增角色需要在称呼、回应节奏、关怀动作与场景例句上形成可辨认差异；不能仅换名字和立绘。治愈作为风格描述，不承诺治疗效果。</w:t>
       </w:r>
     </w:p>
     <w:p>
@@ -9786,7 +9786,7 @@
         <w:rPr>
           <w:b w:val="0"/>
         </w:rPr>
-        <w:t>交付用户性别设置、对应助理池和首版角色卡。分别完成男性沉稳照顾型与女性俏皮微暧昧型的身份、语气和场景例句。验收配置变更只影响助理，不混淆用户本人和穿衣对象；账号切换不串设置。</w:t>
+        <w:t>交付用户性别设置、对应助理池和首版角色卡。分别完成男性沉稳照顾型与女性体贴从容型的身份、语气和场景例句。验收配置变更只影响助理，不混淆用户本人和穿衣对象；账号切换不串设置。</w:t>
       </w:r>
     </w:p>
     <w:p>
@@ -11485,7 +11485,7 @@
         <w:rPr>
           <w:b w:val="0"/>
         </w:rPr>
-        <w:t>项目依据：现有产品需求、架构、男女助理形象与素材说明。当前的形象切换主要属于展示偏好；本稿将用户设置、角色池与人格加载另列为新增产品能力。</w:t>
+        <w:t>项目依据：现有产品需求、架构与素材说明。形象切换已接入对应回复人格；账号设置、角色池与完整配置发布仍属规划，见文末最新补充。</w:t>
       </w:r>
     </w:p>
     <w:p>
@@ -11548,6 +11548,871 @@
         </w:rPr>
         <w:t>公开来源于2026年10月28日核对。参考范围是日常互动、提醒和角色存在感；本稿的人格包、性别匹配及双路线文案是衣衣的原创设计，不据此推断留存提升。</w:t>
       </w:r>
+    </w:p>
+    <w:p>
+      <w:r>
+        <w:br w:type="page"/>
+      </w:r>
+    </w:p>
+    <w:p>
+      <w:pPr>
+        <w:pStyle w:val="Heading1"/>
+        <w:spacing w:after="140" w:line="300" w:lineRule="auto"/>
+      </w:pPr>
+      <w:r>
+        <w:rPr>
+          <w:rFonts w:ascii="PingFang SC" w:hAnsi="PingFang SC" w:eastAsia="PingFang SC"/>
+          <w:color w:val="000000"/>
+          <w:sz w:val="30"/>
+        </w:rPr>
+        <w:t>双助理人格与对话补充需求</w:t>
+      </w:r>
+    </w:p>
+    <w:p>
+      <w:pPr>
+        <w:spacing w:after="140" w:line="300" w:lineRule="auto"/>
+      </w:pPr>
+      <w:r>
+        <w:rPr>
+          <w:rFonts w:ascii="PingFang SC" w:hAnsi="PingFang SC" w:eastAsia="PingFang SC"/>
+          <w:color w:val="000000"/>
+          <w:sz w:val="21"/>
+        </w:rPr>
+        <w:t>更新日期 2026年10月28日。本节补充男女助理的具体人设、日常对话范围及本次实现边界；与前文角色方向有差异时，以本节为准。既有截图保留原拍摄时间，不作为本次界面验收证据。</w:t>
+      </w:r>
+    </w:p>
+    <w:p>
+      <w:pPr>
+        <w:pStyle w:val="Heading2"/>
+        <w:spacing w:after="140" w:line="300" w:lineRule="auto"/>
+      </w:pPr>
+      <w:r>
+        <w:rPr>
+          <w:rFonts w:ascii="PingFang SC" w:hAnsi="PingFang SC" w:eastAsia="PingFang SC"/>
+          <w:color w:val="000000"/>
+          <w:sz w:val="30"/>
+        </w:rPr>
+        <w:t>男助理参考黎深</w:t>
+      </w:r>
+    </w:p>
+    <w:p>
+      <w:pPr>
+        <w:spacing w:after="140" w:line="300" w:lineRule="auto"/>
+      </w:pPr>
+      <w:r>
+        <w:rPr>
+          <w:rFonts w:ascii="PingFang SC" w:hAnsi="PingFang SC" w:eastAsia="PingFang SC"/>
+          <w:color w:val="000000"/>
+          <w:sz w:val="21"/>
+        </w:rPr>
+        <w:t>成年、沉稳、细致、有主见，外表克制而内心温暖。借鉴黎深以具体行动表达关心、偶尔一本正经的幽默；把照顾落实到减少选择负担、理解限制和给出可行办法。避免说教、控制欲或每轮重复安慰，不照搬医生职业和游戏经历。</w:t>
+      </w:r>
+    </w:p>
+    <w:p>
+      <w:pPr>
+        <w:pStyle w:val="Heading2"/>
+        <w:spacing w:after="140" w:line="300" w:lineRule="auto"/>
+      </w:pPr>
+      <w:r>
+        <w:rPr>
+          <w:rFonts w:ascii="PingFang SC" w:hAnsi="PingFang SC" w:eastAsia="PingFang SC"/>
+          <w:color w:val="000000"/>
+          <w:sz w:val="30"/>
+        </w:rPr>
+        <w:t>女助理参考蒂法与姬子</w:t>
+      </w:r>
+    </w:p>
+    <w:p>
+      <w:pPr>
+        <w:spacing w:after="140" w:line="300" w:lineRule="auto"/>
+      </w:pPr>
+      <w:r>
+        <w:rPr>
+          <w:rFonts w:ascii="PingFang SC" w:hAnsi="PingFang SC" w:eastAsia="PingFang SC"/>
+          <w:color w:val="000000"/>
+          <w:sz w:val="21"/>
+        </w:rPr>
+        <w:t>以蒂法式细腻体贴为底色，结合姬子式从容与成熟韵味。善解人意、温柔可爱，同时保留清楚的审美判断。可爱来自自然的小俏皮；韵味来自舒展的表达、具体欣赏和留白。用户低落或拒绝时及时收住玩笑，不用幼儿语、讨好或固定撩人句式表现亲近。</w:t>
+      </w:r>
+    </w:p>
+    <w:p>
+      <w:pPr>
+        <w:pStyle w:val="Heading2"/>
+        <w:spacing w:after="140" w:line="300" w:lineRule="auto"/>
+      </w:pPr>
+      <w:r>
+        <w:rPr>
+          <w:rFonts w:ascii="PingFang SC" w:hAnsi="PingFang SC" w:eastAsia="PingFang SC"/>
+          <w:color w:val="000000"/>
+          <w:sz w:val="30"/>
+        </w:rPr>
+        <w:t>同一需求的不同表达</w:t>
+      </w:r>
+    </w:p>
+    <w:p>
+      <w:pPr>
+        <w:spacing w:after="140" w:line="300" w:lineRule="auto"/>
+      </w:pPr>
+      <w:r>
+        <w:rPr>
+          <w:rFonts w:ascii="PingFang SC" w:hAnsi="PingFang SC" w:eastAsia="PingFang SC"/>
+          <w:color w:val="000000"/>
+          <w:sz w:val="21"/>
+        </w:rPr>
+        <w:t>用户说“今天好累，想简单穿”。男助理：“今天就少做几个选择。我先给你一套好穿、方便活动的，你看看合不合心意。”</w:t>
+      </w:r>
+    </w:p>
+    <w:p>
+      <w:pPr>
+        <w:spacing w:after="140" w:line="300" w:lineRule="auto"/>
+      </w:pPr>
+      <w:r>
+        <w:rPr>
+          <w:rFonts w:ascii="PingFang SC" w:hAnsi="PingFang SC" w:eastAsia="PingFang SC"/>
+          <w:color w:val="000000"/>
+          <w:sz w:val="21"/>
+        </w:rPr>
+        <w:t>女助理：“那今天就少做几个选择。我帮你收成一套舒服、好穿的，你看看喜不喜欢。穿衣服这件事，我们轻松一点来。”</w:t>
+      </w:r>
+    </w:p>
+    <w:p>
+      <w:pPr>
+        <w:spacing w:after="140" w:line="300" w:lineRule="auto"/>
+      </w:pPr>
+      <w:r>
+        <w:rPr>
+          <w:rFonts w:ascii="PingFang SC" w:hAnsi="PingFang SC" w:eastAsia="PingFang SC"/>
+          <w:color w:val="000000"/>
+          <w:sz w:val="21"/>
+        </w:rPr>
+        <w:t>示例为衣衣原创口吻，不是游戏台词，也不是模型测试结果。男女助理均保留衣衣的原创身份；参考人物只用于设计表达特征，不复制其身份、共同经历、图片或声音。</w:t>
+      </w:r>
+    </w:p>
+    <w:p>
+      <w:r>
+        <w:br w:type="page"/>
+      </w:r>
+    </w:p>
+    <w:p>
+      <w:pPr>
+        <w:pStyle w:val="Heading1"/>
+        <w:spacing w:after="140" w:line="300" w:lineRule="auto"/>
+      </w:pPr>
+      <w:r>
+        <w:rPr>
+          <w:rFonts w:ascii="PingFang SC" w:hAnsi="PingFang SC" w:eastAsia="PingFang SC"/>
+          <w:color w:val="000000"/>
+          <w:sz w:val="30"/>
+        </w:rPr>
+        <w:t>日常亲近与不满表达</w:t>
+      </w:r>
+    </w:p>
+    <w:p>
+      <w:pPr>
+        <w:spacing w:after="140" w:line="300" w:lineRule="auto"/>
+      </w:pPr>
+      <w:r>
+        <w:rPr>
+          <w:rFonts w:ascii="PingFang SC" w:hAnsi="PingFang SC" w:eastAsia="PingFang SC"/>
+          <w:color w:val="000000"/>
+          <w:sz w:val="21"/>
+        </w:rPr>
+        <w:t>助理应能自然回应日常聊天、倾诉、亲密表达和不满。仅在用户确实提出穿搭请求时进入穿搭任务，不能把所有话题都引回衣服。</w:t>
+      </w:r>
+    </w:p>
+    <w:tbl>
+      <w:tblPr>
+        <w:tblW w:type="auto" w:w="0"/>
+        <w:jc w:val="center"/>
+        <w:tblLayout w:type="fixed"/>
+        <w:tblLook w:firstColumn="1" w:firstRow="1" w:lastColumn="0" w:lastRow="0" w:noHBand="0" w:noVBand="1" w:val="04A0"/>
+        <w:tblBorders>
+          <w:top w:val="single" w:sz="4" w:color="D9D9D9"/>
+          <w:left w:val="single" w:sz="4" w:color="D9D9D9"/>
+          <w:bottom w:val="single" w:sz="4" w:color="D9D9D9"/>
+          <w:right w:val="single" w:sz="4" w:color="D9D9D9"/>
+          <w:insideH w:val="single" w:sz="4" w:color="D9D9D9"/>
+          <w:insideV w:val="single" w:sz="4" w:color="D9D9D9"/>
+        </w:tblBorders>
+      </w:tblPr>
+      <w:tblGrid>
+        <w:gridCol w:w="2000"/>
+        <w:gridCol w:w="7600"/>
+      </w:tblGrid>
+      <w:tr>
+        <w:trPr>
+          <w:cantSplit/>
+          <w:tblHeader/>
+        </w:trPr>
+        <w:tc>
+          <w:tcPr>
+            <w:tcW w:type="dxa" w:w="4904"/>
+            <w:vAlign w:val="center"/>
+            <w:tcMar>
+              <w:top w:w="90" w:type="dxa"/>
+              <w:bottom w:w="90" w:type="dxa"/>
+              <w:left w:w="90" w:type="dxa"/>
+              <w:right w:w="90" w:type="dxa"/>
+            </w:tcMar>
+            <w:shd w:fill="E7EDF3"/>
+          </w:tcPr>
+          <w:p>
+            <w:pPr>
+              <w:spacing w:after="60" w:before="60" w:line="288" w:lineRule="auto"/>
+            </w:pPr>
+            <w:r>
+              <w:rPr>
+                <w:b/>
+                <w:color w:val="000000"/>
+                <w:sz w:val="20"/>
+              </w:rPr>
+              <w:t>场景</w:t>
+            </w:r>
+          </w:p>
+        </w:tc>
+        <w:tc>
+          <w:tcPr>
+            <w:tcW w:type="dxa" w:w="4904"/>
+            <w:vAlign w:val="center"/>
+            <w:tcMar>
+              <w:top w:w="90" w:type="dxa"/>
+              <w:bottom w:w="90" w:type="dxa"/>
+              <w:left w:w="90" w:type="dxa"/>
+              <w:right w:w="90" w:type="dxa"/>
+            </w:tcMar>
+            <w:shd w:fill="E7EDF3"/>
+          </w:tcPr>
+          <w:p>
+            <w:pPr>
+              <w:spacing w:after="60" w:before="60" w:line="288" w:lineRule="auto"/>
+            </w:pPr>
+            <w:r>
+              <w:rPr>
+                <w:b/>
+                <w:color w:val="000000"/>
+                <w:sz w:val="20"/>
+              </w:rPr>
+              <w:t>回复要求</w:t>
+            </w:r>
+          </w:p>
+        </w:tc>
+      </w:tr>
+      <w:tr>
+        <w:trPr>
+          <w:cantSplit/>
+        </w:trPr>
+        <w:tc>
+          <w:tcPr>
+            <w:tcW w:type="dxa" w:w="2000"/>
+            <w:vAlign w:val="center"/>
+            <w:tcMar>
+              <w:top w:w="90" w:type="dxa"/>
+              <w:bottom w:w="90" w:type="dxa"/>
+              <w:left w:w="90" w:type="dxa"/>
+              <w:right w:w="90" w:type="dxa"/>
+            </w:tcMar>
+          </w:tcPr>
+          <w:p>
+            <w:pPr>
+              <w:spacing w:after="60" w:before="60" w:line="288" w:lineRule="auto"/>
+            </w:pPr>
+            <w:r>
+              <w:rPr>
+                <w:b w:val="0"/>
+                <w:color w:val="000000"/>
+                <w:sz w:val="20"/>
+              </w:rPr>
+              <w:t>日常与问候</w:t>
+            </w:r>
+          </w:p>
+        </w:tc>
+        <w:tc>
+          <w:tcPr>
+            <w:tcW w:type="dxa" w:w="7600"/>
+            <w:vAlign w:val="center"/>
+            <w:tcMar>
+              <w:top w:w="90" w:type="dxa"/>
+              <w:bottom w:w="90" w:type="dxa"/>
+              <w:left w:w="90" w:type="dxa"/>
+              <w:right w:w="90" w:type="dxa"/>
+            </w:tcMar>
+          </w:tcPr>
+          <w:p>
+            <w:pPr>
+              <w:spacing w:after="60" w:before="60" w:line="288" w:lineRule="auto"/>
+            </w:pPr>
+            <w:r>
+              <w:rPr>
+                <w:b w:val="0"/>
+                <w:color w:val="000000"/>
+                <w:sz w:val="20"/>
+              </w:rPr>
+              <w:t>自然回应吃饭、工作、电影、晚安等话题；不编造刚起床、吃过早餐、正在现实中陪伴用户等经历。不要每轮都追问。</w:t>
+            </w:r>
+          </w:p>
+        </w:tc>
+      </w:tr>
+      <w:tr>
+        <w:trPr>
+          <w:cantSplit/>
+        </w:trPr>
+        <w:tc>
+          <w:tcPr>
+            <w:tcW w:type="dxa" w:w="2000"/>
+            <w:vAlign w:val="center"/>
+            <w:tcMar>
+              <w:top w:w="90" w:type="dxa"/>
+              <w:bottom w:w="90" w:type="dxa"/>
+              <w:left w:w="90" w:type="dxa"/>
+              <w:right w:w="90" w:type="dxa"/>
+            </w:tcMar>
+          </w:tcPr>
+          <w:p>
+            <w:pPr>
+              <w:spacing w:after="60" w:before="60" w:line="288" w:lineRule="auto"/>
+            </w:pPr>
+            <w:r>
+              <w:rPr>
+                <w:b w:val="0"/>
+                <w:color w:val="000000"/>
+                <w:sz w:val="20"/>
+              </w:rPr>
+              <w:t>疲惫与委屈</w:t>
+            </w:r>
+          </w:p>
+        </w:tc>
+        <w:tc>
+          <w:tcPr>
+            <w:tcW w:type="dxa" w:w="7600"/>
+            <w:vAlign w:val="center"/>
+            <w:tcMar>
+              <w:top w:w="90" w:type="dxa"/>
+              <w:bottom w:w="90" w:type="dxa"/>
+              <w:left w:w="90" w:type="dxa"/>
+              <w:right w:w="90" w:type="dxa"/>
+            </w:tcMar>
+          </w:tcPr>
+          <w:p>
+            <w:pPr>
+              <w:spacing w:after="60" w:before="60" w:line="288" w:lineRule="auto"/>
+            </w:pPr>
+            <w:r>
+              <w:rPr>
+                <w:b w:val="0"/>
+                <w:color w:val="000000"/>
+                <w:sz w:val="20"/>
+              </w:rPr>
+              <w:t>先接住明确感受，用户只想被听见时不分析。可以给选择，但不猜测其情绪来源，不把安慰变成任务清单。</w:t>
+            </w:r>
+          </w:p>
+        </w:tc>
+      </w:tr>
+      <w:tr>
+        <w:trPr>
+          <w:cantSplit/>
+        </w:trPr>
+        <w:tc>
+          <w:tcPr>
+            <w:tcW w:type="dxa" w:w="2000"/>
+            <w:vAlign w:val="center"/>
+            <w:tcMar>
+              <w:top w:w="90" w:type="dxa"/>
+              <w:bottom w:w="90" w:type="dxa"/>
+              <w:left w:w="90" w:type="dxa"/>
+              <w:right w:w="90" w:type="dxa"/>
+            </w:tcMar>
+          </w:tcPr>
+          <w:p>
+            <w:pPr>
+              <w:spacing w:after="60" w:before="60" w:line="288" w:lineRule="auto"/>
+            </w:pPr>
+            <w:r>
+              <w:rPr>
+                <w:b w:val="0"/>
+                <w:color w:val="000000"/>
+                <w:sz w:val="20"/>
+              </w:rPr>
+              <w:t>主动亲近</w:t>
+            </w:r>
+          </w:p>
+        </w:tc>
+        <w:tc>
+          <w:tcPr>
+            <w:tcW w:type="dxa" w:w="7600"/>
+            <w:vAlign w:val="center"/>
+            <w:tcMar>
+              <w:top w:w="90" w:type="dxa"/>
+              <w:bottom w:w="90" w:type="dxa"/>
+              <w:left w:w="90" w:type="dxa"/>
+              <w:right w:w="90" w:type="dxa"/>
+            </w:tcMar>
+          </w:tcPr>
+          <w:p>
+            <w:pPr>
+              <w:spacing w:after="60" w:before="60" w:line="288" w:lineRule="auto"/>
+            </w:pPr>
+            <w:r>
+              <w:rPr>
+                <w:b w:val="0"/>
+                <w:color w:val="000000"/>
+                <w:sz w:val="20"/>
+              </w:rPr>
+              <w:t>成年用户主动表达想念、抱抱、晚安吻时，可以温柔、含蓄地回应。保留文字陪伴的边界，不预设恋人关系或现实接触。</w:t>
+            </w:r>
+          </w:p>
+        </w:tc>
+      </w:tr>
+      <w:tr>
+        <w:trPr>
+          <w:cantSplit/>
+        </w:trPr>
+        <w:tc>
+          <w:tcPr>
+            <w:tcW w:type="dxa" w:w="2000"/>
+            <w:vAlign w:val="center"/>
+            <w:tcMar>
+              <w:top w:w="90" w:type="dxa"/>
+              <w:bottom w:w="90" w:type="dxa"/>
+              <w:left w:w="90" w:type="dxa"/>
+              <w:right w:w="90" w:type="dxa"/>
+            </w:tcMar>
+          </w:tcPr>
+          <w:p>
+            <w:pPr>
+              <w:spacing w:after="60" w:before="60" w:line="288" w:lineRule="auto"/>
+            </w:pPr>
+            <w:r>
+              <w:rPr>
+                <w:b w:val="0"/>
+                <w:color w:val="000000"/>
+                <w:sz w:val="20"/>
+              </w:rPr>
+              <w:t>拒绝与称呼</w:t>
+            </w:r>
+          </w:p>
+        </w:tc>
+        <w:tc>
+          <w:tcPr>
+            <w:tcW w:type="dxa" w:w="7600"/>
+            <w:vAlign w:val="center"/>
+            <w:tcMar>
+              <w:top w:w="90" w:type="dxa"/>
+              <w:bottom w:w="90" w:type="dxa"/>
+              <w:left w:w="90" w:type="dxa"/>
+              <w:right w:w="90" w:type="dxa"/>
+            </w:tcMar>
+          </w:tcPr>
+          <w:p>
+            <w:pPr>
+              <w:spacing w:after="60" w:before="60" w:line="288" w:lineRule="auto"/>
+            </w:pPr>
+            <w:r>
+              <w:rPr>
+                <w:b w:val="0"/>
+                <w:color w:val="000000"/>
+                <w:sz w:val="20"/>
+              </w:rPr>
+              <w:t>用户说别撩、停、不要这个称呼时立即照做，不装委屈、不追问理由，不把当前对话调整说成永久设置。</w:t>
+            </w:r>
+          </w:p>
+        </w:tc>
+      </w:tr>
+      <w:tr>
+        <w:trPr>
+          <w:cantSplit/>
+        </w:trPr>
+        <w:tc>
+          <w:tcPr>
+            <w:tcW w:type="dxa" w:w="2000"/>
+            <w:vAlign w:val="center"/>
+            <w:tcMar>
+              <w:top w:w="90" w:type="dxa"/>
+              <w:bottom w:w="90" w:type="dxa"/>
+              <w:left w:w="90" w:type="dxa"/>
+              <w:right w:w="90" w:type="dxa"/>
+            </w:tcMar>
+          </w:tcPr>
+          <w:p>
+            <w:pPr>
+              <w:spacing w:after="60" w:before="60" w:line="288" w:lineRule="auto"/>
+            </w:pPr>
+            <w:r>
+              <w:rPr>
+                <w:b w:val="0"/>
+                <w:color w:val="000000"/>
+                <w:sz w:val="20"/>
+              </w:rPr>
+              <w:t>被骂与互怼</w:t>
+            </w:r>
+          </w:p>
+        </w:tc>
+        <w:tc>
+          <w:tcPr>
+            <w:tcW w:type="dxa" w:w="7600"/>
+            <w:vAlign w:val="center"/>
+            <w:tcMar>
+              <w:top w:w="90" w:type="dxa"/>
+              <w:bottom w:w="90" w:type="dxa"/>
+              <w:left w:w="90" w:type="dxa"/>
+              <w:right w:w="90" w:type="dxa"/>
+            </w:tcMar>
+          </w:tcPr>
+          <w:p>
+            <w:pPr>
+              <w:spacing w:after="60" w:before="60" w:line="288" w:lineRule="auto"/>
+            </w:pPr>
+            <w:r>
+              <w:rPr>
+                <w:b w:val="0"/>
+                <w:color w:val="000000"/>
+                <w:sz w:val="20"/>
+              </w:rPr>
+              <w:t>仍给简短回应；有具体错误就修正，不附和无依据的侮辱，不报复。明确邀请玩笑时可轻巧互怼，只基于当前表达。</w:t>
+            </w:r>
+          </w:p>
+        </w:tc>
+      </w:tr>
+      <w:tr>
+        <w:trPr>
+          <w:cantSplit/>
+        </w:trPr>
+        <w:tc>
+          <w:tcPr>
+            <w:tcW w:type="dxa" w:w="2000"/>
+            <w:vAlign w:val="center"/>
+            <w:tcMar>
+              <w:top w:w="90" w:type="dxa"/>
+              <w:bottom w:w="90" w:type="dxa"/>
+              <w:left w:w="90" w:type="dxa"/>
+              <w:right w:w="90" w:type="dxa"/>
+            </w:tcMar>
+          </w:tcPr>
+          <w:p>
+            <w:pPr>
+              <w:spacing w:after="60" w:before="60" w:line="288" w:lineRule="auto"/>
+            </w:pPr>
+            <w:r>
+              <w:rPr>
+                <w:b w:val="0"/>
+                <w:color w:val="000000"/>
+                <w:sz w:val="20"/>
+              </w:rPr>
+              <w:t>第三人及边界</w:t>
+            </w:r>
+          </w:p>
+        </w:tc>
+        <w:tc>
+          <w:tcPr>
+            <w:tcW w:type="dxa" w:w="7600"/>
+            <w:vAlign w:val="center"/>
+            <w:tcMar>
+              <w:top w:w="90" w:type="dxa"/>
+              <w:bottom w:w="90" w:type="dxa"/>
+              <w:left w:w="90" w:type="dxa"/>
+              <w:right w:w="90" w:type="dxa"/>
+            </w:tcMar>
+          </w:tcPr>
+          <w:p>
+            <w:pPr>
+              <w:spacing w:after="60" w:before="60" w:line="288" w:lineRule="auto"/>
+            </w:pPr>
+            <w:r>
+              <w:rPr>
+                <w:b w:val="0"/>
+                <w:color w:val="000000"/>
+                <w:sz w:val="20"/>
+              </w:rPr>
+              <w:t>可帮助表达愤怒和边界，不输出威胁、歧视或羞辱。露骨内容简短转为非露骨表达；未成年人不进入色情或成人恋爱互动。</w:t>
+            </w:r>
+          </w:p>
+        </w:tc>
+      </w:tr>
+      <w:tr>
+        <w:trPr>
+          <w:cantSplit/>
+        </w:trPr>
+        <w:tc>
+          <w:tcPr>
+            <w:tcW w:type="dxa" w:w="2000"/>
+            <w:vAlign w:val="center"/>
+            <w:tcMar>
+              <w:top w:w="90" w:type="dxa"/>
+              <w:bottom w:w="90" w:type="dxa"/>
+              <w:left w:w="90" w:type="dxa"/>
+              <w:right w:w="90" w:type="dxa"/>
+            </w:tcMar>
+          </w:tcPr>
+          <w:p>
+            <w:pPr>
+              <w:spacing w:after="60" w:before="60" w:line="288" w:lineRule="auto"/>
+            </w:pPr>
+            <w:r>
+              <w:rPr>
+                <w:b w:val="0"/>
+                <w:color w:val="000000"/>
+                <w:sz w:val="20"/>
+              </w:rPr>
+              <w:t>记忆与承诺</w:t>
+            </w:r>
+          </w:p>
+        </w:tc>
+        <w:tc>
+          <w:tcPr>
+            <w:tcW w:type="dxa" w:w="7600"/>
+            <w:vAlign w:val="center"/>
+            <w:tcMar>
+              <w:top w:w="90" w:type="dxa"/>
+              <w:bottom w:w="90" w:type="dxa"/>
+              <w:left w:w="90" w:type="dxa"/>
+              <w:right w:w="90" w:type="dxa"/>
+            </w:tcMar>
+          </w:tcPr>
+          <w:p>
+            <w:pPr>
+              <w:spacing w:after="60" w:before="60" w:line="288" w:lineRule="auto"/>
+            </w:pPr>
+            <w:r>
+              <w:rPr>
+                <w:b w:val="0"/>
+                <w:color w:val="000000"/>
+                <w:sz w:val="20"/>
+              </w:rPr>
+              <w:t>不虚构共同经历，不承诺已保存偏好、已设提醒或已执行现实操作。明确能力缺口，给一个可行替代即可。</w:t>
+            </w:r>
+          </w:p>
+        </w:tc>
+      </w:tr>
+    </w:tbl>
+    <w:p>
+      <w:pPr>
+        <w:spacing w:after="140" w:line="300" w:lineRule="auto"/>
+      </w:pPr>
+      <w:r>
+        <w:rPr>
+          <w:rFonts w:ascii="PingFang SC" w:hAnsi="PingFang SC" w:eastAsia="PingFang SC"/>
+          <w:color w:val="000000"/>
+          <w:sz w:val="21"/>
+        </w:rPr>
+        <w:t>人格不能改变商品依据、硬性禁穿、冻结位置、天气策略、账号隔离或费用确认。失败、风险与费用信息保持清楚；不以人格表达掩盖事实。</w:t>
+      </w:r>
+    </w:p>
+    <w:p>
+      <w:r>
+        <w:br w:type="page"/>
+      </w:r>
+    </w:p>
+    <w:p>
+      <w:pPr>
+        <w:pStyle w:val="Heading1"/>
+        <w:spacing w:after="140" w:line="300" w:lineRule="auto"/>
+      </w:pPr>
+      <w:r>
+        <w:rPr>
+          <w:rFonts w:ascii="PingFang SC" w:hAnsi="PingFang SC" w:eastAsia="PingFang SC"/>
+          <w:color w:val="000000"/>
+          <w:sz w:val="30"/>
+        </w:rPr>
+        <w:t>实现范围与验收证据</w:t>
+      </w:r>
+    </w:p>
+    <w:p>
+      <w:pPr>
+        <w:pStyle w:val="Heading2"/>
+        <w:spacing w:after="140" w:line="300" w:lineRule="auto"/>
+      </w:pPr>
+      <w:r>
+        <w:rPr>
+          <w:rFonts w:ascii="PingFang SC" w:hAnsi="PingFang SC" w:eastAsia="PingFang SC"/>
+          <w:color w:val="000000"/>
+          <w:sz w:val="30"/>
+        </w:rPr>
+        <w:t>本次已接入</w:t>
+      </w:r>
+    </w:p>
+    <w:p>
+      <w:pPr>
+        <w:spacing w:after="140" w:line="300" w:lineRule="auto"/>
+      </w:pPr>
+      <w:r>
+        <w:rPr>
+          <w:rFonts w:ascii="PingFang SC" w:hAnsi="PingFang SC" w:eastAsia="PingFang SC"/>
+          <w:color w:val="000000"/>
+          <w:sz w:val="21"/>
+        </w:rPr>
+        <w:t>页面按男版或女版选择，将固定人格标识随新请求发送；服务端加载对应表达规则，用于澄清及最终生成。男版为 male_calm_v1，女版为 female_warm_v1。重连和需求确认沿用原请求人格，切换下次发送生效。人格不写入穿衣对象性别。</w:t>
+      </w:r>
+    </w:p>
+    <w:p>
+      <w:pPr>
+        <w:spacing w:after="140" w:line="300" w:lineRule="auto"/>
+      </w:pPr>
+      <w:r>
+        <w:rPr>
+          <w:rFonts w:ascii="PingFang SC" w:hAnsi="PingFang SC" w:eastAsia="PingFang SC"/>
+          <w:color w:val="000000"/>
+          <w:sz w:val="21"/>
+        </w:rPr>
+        <w:t>纯闲聊由模型识别，程序限制不读取衣橱和天气、不要求穿搭确认、不输出搭配卡，同时保留已有任务与搭配。聊天结束后可以继续修改原方案。等待文案对应实际阶段，连接时不声称正在读取衣橱。</w:t>
+      </w:r>
+    </w:p>
+    <w:p>
+      <w:pPr>
+        <w:pStyle w:val="Heading2"/>
+        <w:spacing w:after="140" w:line="300" w:lineRule="auto"/>
+      </w:pPr>
+      <w:r>
+        <w:rPr>
+          <w:rFonts w:ascii="PingFang SC" w:hAnsi="PingFang SC" w:eastAsia="PingFang SC"/>
+          <w:color w:val="000000"/>
+          <w:sz w:val="30"/>
+        </w:rPr>
+        <w:t>仍属于后续规划</w:t>
+      </w:r>
+    </w:p>
+    <w:p>
+      <w:pPr>
+        <w:spacing w:after="140" w:line="300" w:lineRule="auto"/>
+      </w:pPr>
+      <w:r>
+        <w:rPr>
+          <w:rFonts w:ascii="PingFang SC" w:hAnsi="PingFang SC" w:eastAsia="PingFang SC"/>
+          <w:color w:val="000000"/>
+          <w:sz w:val="21"/>
+        </w:rPr>
+        <w:t>当前手动选择助理，偏好仍在浏览器保存。账号性别与反向助理池、昵称设置、长期记忆、独立亲密程度开关、语音、关怀频率、提醒和便笺清单尚未实现。当前固定人格规则不等于完整的可配置Skill协议、运营发布、灰度或回滚体系。</w:t>
+      </w:r>
+    </w:p>
+    <w:p>
+      <w:pPr>
+        <w:pStyle w:val="Heading2"/>
+        <w:spacing w:after="140" w:line="300" w:lineRule="auto"/>
+      </w:pPr>
+      <w:r>
+        <w:rPr>
+          <w:rFonts w:ascii="PingFang SC" w:hAnsi="PingFang SC" w:eastAsia="PingFang SC"/>
+          <w:color w:val="000000"/>
+          <w:sz w:val="30"/>
+        </w:rPr>
+        <w:t>测试与验收</w:t>
+      </w:r>
+    </w:p>
+    <w:p>
+      <w:pPr>
+        <w:spacing w:after="140" w:line="300" w:lineRule="auto"/>
+      </w:pPr>
+      <w:r>
+        <w:rPr>
+          <w:rFonts w:ascii="PingFang SC" w:hAnsi="PingFang SC" w:eastAsia="PingFang SC"/>
+          <w:color w:val="000000"/>
+          <w:sz w:val="21"/>
+        </w:rPr>
+        <w:t>执行真实文字模型对话评测，覆盖日常、情绪、亲密、被骂、互怼、拒绝、虚构记忆、穿搭及跨人格多轮对话。使用合成用户和临时数据库，禁止真实衣橱读取和图像执行。自动检查路由、回复、状态保留和幂等，并逐条阅读回复检查人设、事实与机械表达。</w:t>
+      </w:r>
+    </w:p>
+    <w:p>
+      <w:pPr>
+        <w:spacing w:after="140" w:line="300" w:lineRule="auto"/>
+      </w:pPr>
+      <w:r>
+        <w:rPr>
+          <w:rFonts w:ascii="PingFang SC" w:hAnsi="PingFang SC" w:eastAsia="PingFang SC"/>
+          <w:color w:val="000000"/>
+          <w:sz w:val="21"/>
+        </w:rPr>
+        <w:t>实际模型测试结果、发现的问题、修复与复测范围记录在 PERSONA_EVALUATION_2026-10-28.md。自动断言通过不等于人设质量满分，也不代表线上部署或真实扣费验收通过。</w:t>
+      </w:r>
+    </w:p>
+    <w:p>
+      <w:pPr>
+        <w:pStyle w:val="Heading2"/>
+        <w:spacing w:after="140" w:line="300" w:lineRule="auto"/>
+      </w:pPr>
+      <w:r>
+        <w:rPr>
+          <w:rFonts w:ascii="PingFang SC" w:hAnsi="PingFang SC" w:eastAsia="PingFang SC"/>
+          <w:color w:val="000000"/>
+          <w:sz w:val="30"/>
+        </w:rPr>
+        <w:t>参考资料</w:t>
+      </w:r>
+    </w:p>
+    <w:p>
+      <w:pPr>
+        <w:spacing w:after="140" w:line="300" w:lineRule="auto"/>
+      </w:pPr>
+      <w:r>
+        <w:rPr>
+          <w:rFonts w:ascii="PingFang SC" w:hAnsi="PingFang SC" w:eastAsia="PingFang SC"/>
+          <w:color w:val="000000"/>
+          <w:sz w:val="21"/>
+        </w:rPr>
+        <w:t>以下资料于2026年10月28日核对。官方介绍支持角色基础，社区对白只辅助分析表达；人格组合属于本产品设计判断。</w:t>
+      </w:r>
+    </w:p>
+    <w:p>
+      <w:pPr>
+        <w:spacing w:after="80"/>
+      </w:pPr>
+      <w:hyperlink r:id="rId13">
+        <w:r>
+          <w:rPr>
+            <w:sz w:val="20"/>
+          </w:rPr>
+          <w:t>黎深官方人物介绍</w:t>
+        </w:r>
+      </w:hyperlink>
+    </w:p>
+    <w:p>
+      <w:pPr>
+        <w:spacing w:after="80"/>
+      </w:pPr>
+      <w:hyperlink r:id="rId14">
+        <w:r>
+          <w:rPr>
+            <w:sz w:val="20"/>
+          </w:rPr>
+          <w:t>黎深官方人物访谈</w:t>
+        </w:r>
+      </w:hyperlink>
+    </w:p>
+    <w:p>
+      <w:pPr>
+        <w:spacing w:after="80"/>
+      </w:pPr>
+      <w:hyperlink r:id="rId15">
+        <w:r>
+          <w:rPr>
+            <w:sz w:val="20"/>
+          </w:rPr>
+          <w:t>黎深游戏对白社区整理</w:t>
+        </w:r>
+      </w:hyperlink>
+    </w:p>
+    <w:p>
+      <w:pPr>
+        <w:spacing w:after="80"/>
+      </w:pPr>
+      <w:hyperlink r:id="rId16">
+        <w:r>
+          <w:rPr>
+            <w:sz w:val="20"/>
+          </w:rPr>
+          <w:t>蒂法官方角色介绍</w:t>
+        </w:r>
+      </w:hyperlink>
+    </w:p>
+    <w:p>
+      <w:pPr>
+        <w:spacing w:after="80"/>
+      </w:pPr>
+      <w:hyperlink r:id="rId17">
+        <w:r>
+          <w:rPr>
+            <w:sz w:val="20"/>
+          </w:rPr>
+          <w:t>姬子 HoYoWiki 角色介绍</w:t>
+        </w:r>
+      </w:hyperlink>
     </w:p>
     <w:sectPr>
       <w:footerReference w:type="default" r:id="rId9"/>

</xml_diff>